<commit_message>
More page count fixes (#149)
</commit_message>
<xml_diff>
--- a/src/Tests/Inputs/content_control_inline/input.docx
+++ b/src/Tests/Inputs/content_control_inline/input.docx
@@ -86,12 +86,12 @@
           <w:tag w:val="date1"/>
           <w:alias w:val="Due Date"/>
           <w:date w:fullDate="2025-06-15T00:00:00Z">
-            <w:dateFormat w:val="M/d/yyyy"/>
+            <w:dateFormat w:val="yyyy-MM-dd"/>
           </w:date>
         </w:sdtPr>
         <w:sdtContent>
           <w:r>
-            <w:t>6/15/2025</w:t>
+            <w:t>2025-06-15</w:t>
           </w:r>
         </w:sdtContent>
       </w:sdt>

</xml_diff>